<commit_message>
fix: include all staffing categories in exports
</commit_message>
<xml_diff>
--- a/templates/安序物业_住宅物业服务投标文件_双括号动态母版_清理版.docx
+++ b/templates/安序物业_住宅物业服务投标文件_双括号动态母版_清理版.docx
@@ -2770,7 +2770,7 @@
         <w:ind w:firstLine="482"/>
       </w:pPr>
       <w:r>
-        <w:t>项目实行项目经理负责制，现场设置客户服务、客助服务、环境清洁和绿化养护专业单元，公司运营、品质、人力和财务条线提供后台支持。人员配置与</w:t>
+        <w:t>项目实行项目经理负责制，按客户服务、客助服务、环境清洁、绿化养护、四害消杀、工程委外、工程常规和管理人员八类配置人员，公司运营、品质、人力和财务条线提供后台支持。人员配置与</w:t>
       </w:r>
       <w:r>
         <w:t>{{</w:t>
@@ -3263,6 +3263,382 @@
                 <w:sz w:val="21"/>
               </w:rPr>
               <w:t>}}</w:t>
+            </w:r>
+          </w:p>
+        </w:tc>
+      </w:tr>
+      <w:tr>
+        <w:tc>
+          <w:tcPr>
+            <w:tcW w:w="1062" w:type="dxa"/>
+            <w:shd w:val="clear" w:color="auto" w:fill="FFFFFF"/>
+            <w:tcMar>
+              <w:top w:w="70" w:type="dxa"/>
+              <w:left w:w="100" w:type="dxa"/>
+              <w:bottom w:w="70" w:type="dxa"/>
+              <w:right w:w="100" w:type="dxa"/>
+            </w:tcMar>
+            <w:vAlign w:val="center"/>
+          </w:tcPr>
+          <w:p>
+            <w:pPr>
+              <w:spacing w:line="259" w:lineRule="auto"/>
+              <w:jc w:val="center"/>
+            </w:pPr>
+            <w:r>
+              <w:rPr>
+                <w:rFonts w:eastAsia="宋体"/>
+                <w:sz w:val="21"/>
+              </w:rPr>
+              <w:t>5</w:t>
+            </w:r>
+          </w:p>
+        </w:tc>
+        <w:tc>
+          <w:tcPr>
+            <w:tcW w:w="2779" w:type="dxa"/>
+            <w:shd w:val="clear" w:color="auto" w:fill="FFFFFF"/>
+            <w:tcMar>
+              <w:top w:w="70" w:type="dxa"/>
+              <w:left w:w="100" w:type="dxa"/>
+              <w:bottom w:w="70" w:type="dxa"/>
+              <w:right w:w="100" w:type="dxa"/>
+            </w:tcMar>
+            <w:vAlign w:val="center"/>
+          </w:tcPr>
+          <w:p>
+            <w:pPr>
+              <w:spacing w:line="259" w:lineRule="auto"/>
+              <w:jc w:val="left"/>
+            </w:pPr>
+            <w:r>
+              <w:rPr>
+                <w:rFonts w:eastAsia="宋体"/>
+                <w:sz w:val="21"/>
+              </w:rPr>
+              <w:t>四害消杀</w:t>
+            </w:r>
+          </w:p>
+        </w:tc>
+        <w:tc>
+          <w:tcPr>
+            <w:tcW w:w="1308" w:type="dxa"/>
+            <w:shd w:val="clear" w:color="auto" w:fill="FFFFFF"/>
+            <w:tcMar>
+              <w:top w:w="70" w:type="dxa"/>
+              <w:left w:w="100" w:type="dxa"/>
+              <w:bottom w:w="70" w:type="dxa"/>
+              <w:right w:w="100" w:type="dxa"/>
+            </w:tcMar>
+            <w:vAlign w:val="center"/>
+          </w:tcPr>
+          <w:p>
+            <w:pPr>
+              <w:spacing w:line="259" w:lineRule="auto"/>
+              <w:jc w:val="center"/>
+            </w:pPr>
+            <w:r>
+              <w:rPr>
+                <w:rFonts w:eastAsia="宋体"/>
+                <w:sz w:val="21"/>
+              </w:rPr>
+              <w:t>{{四害消杀人数}}</w:t>
+            </w:r>
+            <w:r>
+              <w:rPr>
+                <w:rFonts w:eastAsia="宋体"/>
+                <w:sz w:val="21"/>
+              </w:rPr>
+              <w:t/>
+            </w:r>
+            <w:r>
+              <w:rPr>
+                <w:rFonts w:eastAsia="宋体"/>
+                <w:sz w:val="21"/>
+              </w:rPr>
+              <w:t/>
+            </w:r>
+          </w:p>
+        </w:tc>
+      </w:tr>
+      <w:tr>
+        <w:tc>
+          <w:tcPr>
+            <w:tcW w:w="1062" w:type="dxa"/>
+            <w:shd w:val="clear" w:color="auto" w:fill="FFFFFF"/>
+            <w:tcMar>
+              <w:top w:w="70" w:type="dxa"/>
+              <w:left w:w="100" w:type="dxa"/>
+              <w:bottom w:w="70" w:type="dxa"/>
+              <w:right w:w="100" w:type="dxa"/>
+            </w:tcMar>
+            <w:vAlign w:val="center"/>
+          </w:tcPr>
+          <w:p>
+            <w:pPr>
+              <w:spacing w:line="259" w:lineRule="auto"/>
+              <w:jc w:val="center"/>
+            </w:pPr>
+            <w:r>
+              <w:rPr>
+                <w:rFonts w:eastAsia="宋体"/>
+                <w:sz w:val="21"/>
+              </w:rPr>
+              <w:t>6</w:t>
+            </w:r>
+          </w:p>
+        </w:tc>
+        <w:tc>
+          <w:tcPr>
+            <w:tcW w:w="2779" w:type="dxa"/>
+            <w:shd w:val="clear" w:color="auto" w:fill="FFFFFF"/>
+            <w:tcMar>
+              <w:top w:w="70" w:type="dxa"/>
+              <w:left w:w="100" w:type="dxa"/>
+              <w:bottom w:w="70" w:type="dxa"/>
+              <w:right w:w="100" w:type="dxa"/>
+            </w:tcMar>
+            <w:vAlign w:val="center"/>
+          </w:tcPr>
+          <w:p>
+            <w:pPr>
+              <w:spacing w:line="259" w:lineRule="auto"/>
+              <w:jc w:val="left"/>
+            </w:pPr>
+            <w:r>
+              <w:rPr>
+                <w:rFonts w:eastAsia="宋体"/>
+                <w:sz w:val="21"/>
+              </w:rPr>
+              <w:t>工程委外</w:t>
+            </w:r>
+          </w:p>
+        </w:tc>
+        <w:tc>
+          <w:tcPr>
+            <w:tcW w:w="1308" w:type="dxa"/>
+            <w:shd w:val="clear" w:color="auto" w:fill="FFFFFF"/>
+            <w:tcMar>
+              <w:top w:w="70" w:type="dxa"/>
+              <w:left w:w="100" w:type="dxa"/>
+              <w:bottom w:w="70" w:type="dxa"/>
+              <w:right w:w="100" w:type="dxa"/>
+            </w:tcMar>
+            <w:vAlign w:val="center"/>
+          </w:tcPr>
+          <w:p>
+            <w:pPr>
+              <w:spacing w:line="259" w:lineRule="auto"/>
+              <w:jc w:val="center"/>
+            </w:pPr>
+            <w:r>
+              <w:rPr>
+                <w:rFonts w:eastAsia="宋体"/>
+                <w:sz w:val="21"/>
+              </w:rPr>
+              <w:t>{{工程委外人数}}</w:t>
+            </w:r>
+            <w:r>
+              <w:rPr>
+                <w:rFonts w:eastAsia="宋体"/>
+                <w:sz w:val="21"/>
+              </w:rPr>
+              <w:t/>
+            </w:r>
+            <w:r>
+              <w:rPr>
+                <w:rFonts w:eastAsia="宋体"/>
+                <w:sz w:val="21"/>
+              </w:rPr>
+              <w:t/>
+            </w:r>
+          </w:p>
+        </w:tc>
+      </w:tr>
+      <w:tr>
+        <w:tc>
+          <w:tcPr>
+            <w:tcW w:w="1062" w:type="dxa"/>
+            <w:shd w:val="clear" w:color="auto" w:fill="FFFFFF"/>
+            <w:tcMar>
+              <w:top w:w="70" w:type="dxa"/>
+              <w:left w:w="100" w:type="dxa"/>
+              <w:bottom w:w="70" w:type="dxa"/>
+              <w:right w:w="100" w:type="dxa"/>
+            </w:tcMar>
+            <w:vAlign w:val="center"/>
+          </w:tcPr>
+          <w:p>
+            <w:pPr>
+              <w:spacing w:line="259" w:lineRule="auto"/>
+              <w:jc w:val="center"/>
+            </w:pPr>
+            <w:r>
+              <w:rPr>
+                <w:rFonts w:eastAsia="宋体"/>
+                <w:sz w:val="21"/>
+              </w:rPr>
+              <w:t>7</w:t>
+            </w:r>
+          </w:p>
+        </w:tc>
+        <w:tc>
+          <w:tcPr>
+            <w:tcW w:w="2779" w:type="dxa"/>
+            <w:shd w:val="clear" w:color="auto" w:fill="FFFFFF"/>
+            <w:tcMar>
+              <w:top w:w="70" w:type="dxa"/>
+              <w:left w:w="100" w:type="dxa"/>
+              <w:bottom w:w="70" w:type="dxa"/>
+              <w:right w:w="100" w:type="dxa"/>
+            </w:tcMar>
+            <w:vAlign w:val="center"/>
+          </w:tcPr>
+          <w:p>
+            <w:pPr>
+              <w:spacing w:line="259" w:lineRule="auto"/>
+              <w:jc w:val="left"/>
+            </w:pPr>
+            <w:r>
+              <w:rPr>
+                <w:rFonts w:eastAsia="宋体"/>
+                <w:sz w:val="21"/>
+              </w:rPr>
+              <w:t>工程常规</w:t>
+            </w:r>
+          </w:p>
+        </w:tc>
+        <w:tc>
+          <w:tcPr>
+            <w:tcW w:w="1308" w:type="dxa"/>
+            <w:shd w:val="clear" w:color="auto" w:fill="FFFFFF"/>
+            <w:tcMar>
+              <w:top w:w="70" w:type="dxa"/>
+              <w:left w:w="100" w:type="dxa"/>
+              <w:bottom w:w="70" w:type="dxa"/>
+              <w:right w:w="100" w:type="dxa"/>
+            </w:tcMar>
+            <w:vAlign w:val="center"/>
+          </w:tcPr>
+          <w:p>
+            <w:pPr>
+              <w:spacing w:line="259" w:lineRule="auto"/>
+              <w:jc w:val="center"/>
+            </w:pPr>
+            <w:r>
+              <w:rPr>
+                <w:rFonts w:eastAsia="宋体"/>
+                <w:sz w:val="21"/>
+              </w:rPr>
+              <w:t>{{工程常规人数}}</w:t>
+            </w:r>
+            <w:r>
+              <w:rPr>
+                <w:rFonts w:eastAsia="宋体"/>
+                <w:sz w:val="21"/>
+              </w:rPr>
+              <w:t/>
+            </w:r>
+            <w:r>
+              <w:rPr>
+                <w:rFonts w:eastAsia="宋体"/>
+                <w:sz w:val="21"/>
+              </w:rPr>
+              <w:t/>
+            </w:r>
+          </w:p>
+        </w:tc>
+      </w:tr>
+      <w:tr>
+        <w:tc>
+          <w:tcPr>
+            <w:tcW w:w="1062" w:type="dxa"/>
+            <w:shd w:val="clear" w:color="auto" w:fill="FFFFFF"/>
+            <w:tcMar>
+              <w:top w:w="70" w:type="dxa"/>
+              <w:left w:w="100" w:type="dxa"/>
+              <w:bottom w:w="70" w:type="dxa"/>
+              <w:right w:w="100" w:type="dxa"/>
+            </w:tcMar>
+            <w:vAlign w:val="center"/>
+          </w:tcPr>
+          <w:p>
+            <w:pPr>
+              <w:spacing w:line="259" w:lineRule="auto"/>
+              <w:jc w:val="center"/>
+            </w:pPr>
+            <w:r>
+              <w:rPr>
+                <w:rFonts w:eastAsia="宋体"/>
+                <w:sz w:val="21"/>
+              </w:rPr>
+              <w:t>8</w:t>
+            </w:r>
+          </w:p>
+        </w:tc>
+        <w:tc>
+          <w:tcPr>
+            <w:tcW w:w="2779" w:type="dxa"/>
+            <w:shd w:val="clear" w:color="auto" w:fill="FFFFFF"/>
+            <w:tcMar>
+              <w:top w:w="70" w:type="dxa"/>
+              <w:left w:w="100" w:type="dxa"/>
+              <w:bottom w:w="70" w:type="dxa"/>
+              <w:right w:w="100" w:type="dxa"/>
+            </w:tcMar>
+            <w:vAlign w:val="center"/>
+          </w:tcPr>
+          <w:p>
+            <w:pPr>
+              <w:spacing w:line="259" w:lineRule="auto"/>
+              <w:jc w:val="left"/>
+            </w:pPr>
+            <w:r>
+              <w:rPr>
+                <w:rFonts w:eastAsia="宋体"/>
+                <w:sz w:val="21"/>
+              </w:rPr>
+              <w:t>管理人员</w:t>
+            </w:r>
+          </w:p>
+        </w:tc>
+        <w:tc>
+          <w:tcPr>
+            <w:tcW w:w="1308" w:type="dxa"/>
+            <w:shd w:val="clear" w:color="auto" w:fill="FFFFFF"/>
+            <w:tcMar>
+              <w:top w:w="70" w:type="dxa"/>
+              <w:left w:w="100" w:type="dxa"/>
+              <w:bottom w:w="70" w:type="dxa"/>
+              <w:right w:w="100" w:type="dxa"/>
+            </w:tcMar>
+            <w:vAlign w:val="center"/>
+          </w:tcPr>
+          <w:p>
+            <w:pPr>
+              <w:spacing w:line="259" w:lineRule="auto"/>
+              <w:jc w:val="center"/>
+            </w:pPr>
+            <w:r>
+              <w:rPr>
+                <w:rFonts w:eastAsia="宋体"/>
+                <w:sz w:val="21"/>
+              </w:rPr>
+              <w:t>{{管理人员人数}}</w:t>
+            </w:r>
+            <w:r>
+              <w:rPr>
+                <w:rFonts w:eastAsia="宋体"/>
+                <w:sz w:val="21"/>
+              </w:rPr>
+              <w:t/>
+            </w:r>
+            <w:r>
+              <w:rPr>
+                <w:rFonts w:eastAsia="宋体"/>
+                <w:sz w:val="21"/>
+              </w:rPr>
+              <w:t/>
             </w:r>
           </w:p>
         </w:tc>

</xml_diff>